<commit_message>
docs(rapport): update memoires v11 and v12
</commit_message>
<xml_diff>
--- a/docs/rapport-stage/memoire-stage-andre-yoann-kenmogne-v11.docx
+++ b/docs/rapport-stage/memoire-stage-andre-yoann-kenmogne-v11.docx
@@ -619,7 +619,12 @@
     <w:p>
       <w:pPr>
         <w:sectPr>
-          <w:footerReference w:type="default" r:id="rId10"/>
+          <w:headerReference w:type="even" r:id="rId10"/>
+          <w:headerReference w:type="default" r:id="rId11"/>
+          <w:footerReference w:type="even" r:id="rId12"/>
+          <w:footerReference w:type="default" r:id="rId13"/>
+          <w:headerReference w:type="first" r:id="rId14"/>
+          <w:footerReference w:type="first" r:id="rId15"/>
           <w:pgSz w:w="12240" w:h="15840"/>
           <w:pgMar w:top="1440" w:right="1440" w:bottom="1440" w:left="1440" w:header="708" w:footer="708" w:gutter="0"/>
           <w:pgBorders w:display="firstPage" w:offsetFrom="page">
@@ -5644,6 +5649,20 @@
     </w:p>
     <w:p>
       <w:pPr>
+        <w:spacing w:after="200" w:line="276" w:lineRule="auto"/>
+        <w:rPr>
+          <w:lang w:val="fr-FR"/>
+        </w:rPr>
+      </w:pPr>
+      <w:r>
+        <w:rPr>
+          <w:lang w:val="fr-FR"/>
+        </w:rPr>
+        <w:br w:type="page"/>
+      </w:r>
+    </w:p>
+    <w:p>
+      <w:pPr>
         <w:spacing w:after="360"/>
         <w:jc w:val="center"/>
         <w:rPr>
@@ -5657,6 +5676,7 @@
           <w:sz w:val="32"/>
           <w:lang w:val="fr-FR"/>
         </w:rPr>
+        <w:lastRenderedPageBreak/>
         <w:t>LISTE DES ABRÉVIATIONS</w:t>
       </w:r>
     </w:p>
@@ -5981,7 +6001,6 @@
               <w:rPr>
                 <w:sz w:val="20"/>
               </w:rPr>
-              <w:lastRenderedPageBreak/>
               <w:t>CNI</w:t>
             </w:r>
           </w:p>
@@ -6597,7 +6616,14 @@
               <w:rPr>
                 <w:lang w:val="fr-FR"/>
               </w:rPr>
-              <w:t>, traitement transactionnel orienté opérations métier</w:t>
+              <w:t xml:space="preserve">, traitement transactionnel orienté </w:t>
+            </w:r>
+            <w:r>
+              <w:rPr>
+                <w:lang w:val="fr-FR"/>
+              </w:rPr>
+              <w:lastRenderedPageBreak/>
+              <w:t>opérations métier</w:t>
             </w:r>
           </w:p>
         </w:tc>
@@ -6612,6 +6638,7 @@
           </w:tcPr>
           <w:p>
             <w:r>
+              <w:lastRenderedPageBreak/>
               <w:t>TTL</w:t>
             </w:r>
           </w:p>
@@ -6818,7 +6845,7 @@
           <w:lang w:val="fr-FR"/>
         </w:rPr>
         <w:sectPr>
-          <w:footerReference w:type="default" r:id="rId11"/>
+          <w:footerReference w:type="default" r:id="rId16"/>
           <w:pgSz w:w="12240" w:h="15840"/>
           <w:pgMar w:top="1440" w:right="1440" w:bottom="1440" w:left="1440" w:header="708" w:footer="708" w:gutter="0"/>
           <w:pgNumType w:fmt="lowerRoman" w:start="1"/>
@@ -10919,7 +10946,7 @@
                     <pic:cNvPicPr/>
                   </pic:nvPicPr>
                   <pic:blipFill>
-                    <a:blip r:embed="rId12"/>
+                    <a:blip r:embed="rId17"/>
                     <a:stretch>
                       <a:fillRect/>
                     </a:stretch>
@@ -11366,7 +11393,7 @@
                     <pic:cNvPicPr/>
                   </pic:nvPicPr>
                   <pic:blipFill>
-                    <a:blip r:embed="rId13"/>
+                    <a:blip r:embed="rId18"/>
                     <a:stretch>
                       <a:fillRect/>
                     </a:stretch>
@@ -11569,7 +11596,7 @@
                     <pic:cNvPicPr/>
                   </pic:nvPicPr>
                   <pic:blipFill>
-                    <a:blip r:embed="rId14"/>
+                    <a:blip r:embed="rId19"/>
                     <a:stretch>
                       <a:fillRect/>
                     </a:stretch>
@@ -13728,7 +13755,7 @@
                     <pic:cNvPicPr/>
                   </pic:nvPicPr>
                   <pic:blipFill>
-                    <a:blip r:embed="rId15"/>
+                    <a:blip r:embed="rId20"/>
                     <a:stretch>
                       <a:fillRect/>
                     </a:stretch>
@@ -14308,7 +14335,7 @@
                     <pic:cNvPicPr/>
                   </pic:nvPicPr>
                   <pic:blipFill>
-                    <a:blip r:embed="rId16"/>
+                    <a:blip r:embed="rId21"/>
                     <a:stretch>
                       <a:fillRect/>
                     </a:stretch>
@@ -14818,7 +14845,7 @@
                     <pic:cNvPicPr/>
                   </pic:nvPicPr>
                   <pic:blipFill>
-                    <a:blip r:embed="rId17"/>
+                    <a:blip r:embed="rId22"/>
                     <a:stretch>
                       <a:fillRect/>
                     </a:stretch>
@@ -16552,7 +16579,7 @@
                     <pic:cNvPicPr/>
                   </pic:nvPicPr>
                   <pic:blipFill>
-                    <a:blip r:embed="rId18"/>
+                    <a:blip r:embed="rId23"/>
                     <a:stretch>
                       <a:fillRect/>
                     </a:stretch>
@@ -18727,7 +18754,7 @@
       </w:pPr>
     </w:p>
     <w:sectPr>
-      <w:footerReference w:type="default" r:id="rId19"/>
+      <w:footerReference w:type="default" r:id="rId24"/>
       <w:pgSz w:w="12240" w:h="15840"/>
       <w:pgMar w:top="1440" w:right="1440" w:bottom="1440" w:left="1440" w:header="708" w:footer="708" w:gutter="0"/>
       <w:pgNumType w:start="1"/>
@@ -18778,31 +18805,22 @@
   <w:p>
     <w:pPr>
       <w:pStyle w:val="Footer"/>
-      <w:jc w:val="center"/>
     </w:pPr>
-    <w:r>
-      <w:fldChar w:fldCharType="begin"/>
-    </w:r>
-    <w:r>
-      <w:instrText>PAGE</w:instrText>
-    </w:r>
-    <w:r>
-      <w:fldChar w:fldCharType="separate"/>
-    </w:r>
-    <w:r>
-      <w:rPr>
-        <w:noProof/>
-      </w:rPr>
-      <w:t>i</w:t>
-    </w:r>
-    <w:r>
-      <w:fldChar w:fldCharType="end"/>
-    </w:r>
   </w:p>
 </w:ftr>
 </file>
 
 <file path=word/footer3.xml><?xml version="1.0" encoding="utf-8"?>
+<w:ftr xmlns:wpc="http://schemas.microsoft.com/office/word/2010/wordprocessingCanvas" xmlns:cx="http://schemas.microsoft.com/office/drawing/2014/chartex" xmlns:cx1="http://schemas.microsoft.com/office/drawing/2015/9/8/chartex" xmlns:cx2="http://schemas.microsoft.com/office/drawing/2015/10/21/chartex" xmlns:cx3="http://schemas.microsoft.com/office/drawing/2016/5/9/chartex" xmlns:cx4="http://schemas.microsoft.com/office/drawing/2016/5/10/chartex" xmlns:cx5="http://schemas.microsoft.com/office/drawing/2016/5/11/chartex" xmlns:cx6="http://schemas.microsoft.com/office/drawing/2016/5/12/chartex" xmlns:cx7="http://schemas.microsoft.com/office/drawing/2016/5/13/chartex" xmlns:cx8="http://schemas.microsoft.com/office/drawing/2016/5/14/chartex" xmlns:mc="http://schemas.openxmlformats.org/markup-compatibility/2006" xmlns:aink="http://schemas.microsoft.com/office/drawing/2016/ink" xmlns:am3d="http://schemas.microsoft.com/office/drawing/2017/model3d" xmlns:o="urn:schemas-microsoft-com:office:office" xmlns:oel="http://schemas.microsoft.com/office/2019/extlst" xmlns:r="http://schemas.openxmlformats.org/officeDocument/2006/relationships" xmlns:m="http://schemas.openxmlformats.org/officeDocument/2006/math" xmlns:v="urn:schemas-microsoft-com:vml" xmlns:wp14="http://schemas.microsoft.com/office/word/2010/wordprocessingDrawing" xmlns:wp="http://schemas.openxmlformats.org/drawingml/2006/wordprocessingDrawing" xmlns:w10="urn:schemas-microsoft-com:office:word" xmlns:w="http://schemas.openxmlformats.org/wordprocessingml/2006/main" xmlns:w14="http://schemas.microsoft.com/office/word/2010/wordml" xmlns:w15="http://schemas.microsoft.com/office/word/2012/wordml" xmlns:w16cex="http://schemas.microsoft.com/office/word/2018/wordml/cex" xmlns:w16cid="http://schemas.microsoft.com/office/word/2016/wordml/cid" xmlns:w16="http://schemas.microsoft.com/office/word/2018/wordml" xmlns:w16du="http://schemas.microsoft.com/office/word/2023/wordml/word16du" xmlns:w16sdtdh="http://schemas.microsoft.com/office/word/2020/wordml/sdtdatahash" xmlns:w16sdtfl="http://schemas.microsoft.com/office/word/2024/wordml/sdtformatlock" xmlns:w16se="http://schemas.microsoft.com/office/word/2015/wordml/symex" xmlns:wpg="http://schemas.microsoft.com/office/word/2010/wordprocessingGroup" xmlns:wpi="http://schemas.microsoft.com/office/word/2010/wordprocessingInk" xmlns:wne="http://schemas.microsoft.com/office/word/2006/wordml" xmlns:wps="http://schemas.microsoft.com/office/word/2010/wordprocessingShape" mc:Ignorable="w14 w15 w16se w16cid w16 w16cex w16sdtdh w16sdtfl w16du wp14">
+  <w:p>
+    <w:pPr>
+      <w:pStyle w:val="Footer"/>
+    </w:pPr>
+  </w:p>
+</w:ftr>
+</file>
+
+<file path=word/footer4.xml><?xml version="1.0" encoding="utf-8"?>
 <w:ftr xmlns:wpc="http://schemas.microsoft.com/office/word/2010/wordprocessingCanvas" xmlns:cx="http://schemas.microsoft.com/office/drawing/2014/chartex" xmlns:cx1="http://schemas.microsoft.com/office/drawing/2015/9/8/chartex" xmlns:cx2="http://schemas.microsoft.com/office/drawing/2015/10/21/chartex" xmlns:cx3="http://schemas.microsoft.com/office/drawing/2016/5/9/chartex" xmlns:cx4="http://schemas.microsoft.com/office/drawing/2016/5/10/chartex" xmlns:cx5="http://schemas.microsoft.com/office/drawing/2016/5/11/chartex" xmlns:cx6="http://schemas.microsoft.com/office/drawing/2016/5/12/chartex" xmlns:cx7="http://schemas.microsoft.com/office/drawing/2016/5/13/chartex" xmlns:cx8="http://schemas.microsoft.com/office/drawing/2016/5/14/chartex" xmlns:mc="http://schemas.openxmlformats.org/markup-compatibility/2006" xmlns:aink="http://schemas.microsoft.com/office/drawing/2016/ink" xmlns:am3d="http://schemas.microsoft.com/office/drawing/2017/model3d" xmlns:o="urn:schemas-microsoft-com:office:office" xmlns:oel="http://schemas.microsoft.com/office/2019/extlst" xmlns:r="http://schemas.openxmlformats.org/officeDocument/2006/relationships" xmlns:m="http://schemas.openxmlformats.org/officeDocument/2006/math" xmlns:v="urn:schemas-microsoft-com:vml" xmlns:wp14="http://schemas.microsoft.com/office/word/2010/wordprocessingDrawing" xmlns:wp="http://schemas.openxmlformats.org/drawingml/2006/wordprocessingDrawing" xmlns:w10="urn:schemas-microsoft-com:office:word" xmlns:w="http://schemas.openxmlformats.org/wordprocessingml/2006/main" xmlns:w14="http://schemas.microsoft.com/office/word/2010/wordml" xmlns:w15="http://schemas.microsoft.com/office/word/2012/wordml" xmlns:w16cex="http://schemas.microsoft.com/office/word/2018/wordml/cex" xmlns:w16cid="http://schemas.microsoft.com/office/word/2016/wordml/cid" xmlns:w16="http://schemas.microsoft.com/office/word/2018/wordml" xmlns:w16du="http://schemas.microsoft.com/office/word/2023/wordml/word16du" xmlns:w16sdtdh="http://schemas.microsoft.com/office/word/2020/wordml/sdtdatahash" xmlns:w16sdtfl="http://schemas.microsoft.com/office/word/2024/wordml/sdtformatlock" xmlns:w16se="http://schemas.microsoft.com/office/word/2015/wordml/symex" xmlns:wpg="http://schemas.microsoft.com/office/word/2010/wordprocessingGroup" xmlns:wpi="http://schemas.microsoft.com/office/word/2010/wordprocessingInk" xmlns:wne="http://schemas.microsoft.com/office/word/2006/wordml" xmlns:wps="http://schemas.microsoft.com/office/word/2010/wordprocessingShape" mc:Ignorable="w14 w15 w16se w16cid w16 w16cex w16sdtdh w16sdtfl w16du wp14">
   <w:p>
     <w:pPr>
@@ -18822,6 +18840,35 @@
       <w:rPr>
         <w:noProof/>
       </w:rPr>
+      <w:t>i</w:t>
+    </w:r>
+    <w:r>
+      <w:fldChar w:fldCharType="end"/>
+    </w:r>
+  </w:p>
+</w:ftr>
+</file>
+
+<file path=word/footer5.xml><?xml version="1.0" encoding="utf-8"?>
+<w:ftr xmlns:wpc="http://schemas.microsoft.com/office/word/2010/wordprocessingCanvas" xmlns:cx="http://schemas.microsoft.com/office/drawing/2014/chartex" xmlns:cx1="http://schemas.microsoft.com/office/drawing/2015/9/8/chartex" xmlns:cx2="http://schemas.microsoft.com/office/drawing/2015/10/21/chartex" xmlns:cx3="http://schemas.microsoft.com/office/drawing/2016/5/9/chartex" xmlns:cx4="http://schemas.microsoft.com/office/drawing/2016/5/10/chartex" xmlns:cx5="http://schemas.microsoft.com/office/drawing/2016/5/11/chartex" xmlns:cx6="http://schemas.microsoft.com/office/drawing/2016/5/12/chartex" xmlns:cx7="http://schemas.microsoft.com/office/drawing/2016/5/13/chartex" xmlns:cx8="http://schemas.microsoft.com/office/drawing/2016/5/14/chartex" xmlns:mc="http://schemas.openxmlformats.org/markup-compatibility/2006" xmlns:aink="http://schemas.microsoft.com/office/drawing/2016/ink" xmlns:am3d="http://schemas.microsoft.com/office/drawing/2017/model3d" xmlns:o="urn:schemas-microsoft-com:office:office" xmlns:oel="http://schemas.microsoft.com/office/2019/extlst" xmlns:r="http://schemas.openxmlformats.org/officeDocument/2006/relationships" xmlns:m="http://schemas.openxmlformats.org/officeDocument/2006/math" xmlns:v="urn:schemas-microsoft-com:vml" xmlns:wp14="http://schemas.microsoft.com/office/word/2010/wordprocessingDrawing" xmlns:wp="http://schemas.openxmlformats.org/drawingml/2006/wordprocessingDrawing" xmlns:w10="urn:schemas-microsoft-com:office:word" xmlns:w="http://schemas.openxmlformats.org/wordprocessingml/2006/main" xmlns:w14="http://schemas.microsoft.com/office/word/2010/wordml" xmlns:w15="http://schemas.microsoft.com/office/word/2012/wordml" xmlns:w16cex="http://schemas.microsoft.com/office/word/2018/wordml/cex" xmlns:w16cid="http://schemas.microsoft.com/office/word/2016/wordml/cid" xmlns:w16="http://schemas.microsoft.com/office/word/2018/wordml" xmlns:w16du="http://schemas.microsoft.com/office/word/2023/wordml/word16du" xmlns:w16sdtdh="http://schemas.microsoft.com/office/word/2020/wordml/sdtdatahash" xmlns:w16sdtfl="http://schemas.microsoft.com/office/word/2024/wordml/sdtformatlock" xmlns:w16se="http://schemas.microsoft.com/office/word/2015/wordml/symex" xmlns:wpg="http://schemas.microsoft.com/office/word/2010/wordprocessingGroup" xmlns:wpi="http://schemas.microsoft.com/office/word/2010/wordprocessingInk" xmlns:wne="http://schemas.microsoft.com/office/word/2006/wordml" xmlns:wps="http://schemas.microsoft.com/office/word/2010/wordprocessingShape" mc:Ignorable="w14 w15 w16se w16cid w16 w16cex w16sdtdh w16sdtfl w16du wp14">
+  <w:p>
+    <w:pPr>
+      <w:pStyle w:val="Footer"/>
+      <w:jc w:val="center"/>
+    </w:pPr>
+    <w:r>
+      <w:fldChar w:fldCharType="begin"/>
+    </w:r>
+    <w:r>
+      <w:instrText>PAGE</w:instrText>
+    </w:r>
+    <w:r>
+      <w:fldChar w:fldCharType="separate"/>
+    </w:r>
+    <w:r>
+      <w:rPr>
+        <w:noProof/>
+      </w:rPr>
       <w:t>1</w:t>
     </w:r>
     <w:r>
@@ -18854,6 +18901,36 @@
     </w:p>
   </w:footnote>
 </w:footnotes>
+</file>
+
+<file path=word/header1.xml><?xml version="1.0" encoding="utf-8"?>
+<w:hdr xmlns:wpc="http://schemas.microsoft.com/office/word/2010/wordprocessingCanvas" xmlns:cx="http://schemas.microsoft.com/office/drawing/2014/chartex" xmlns:cx1="http://schemas.microsoft.com/office/drawing/2015/9/8/chartex" xmlns:cx2="http://schemas.microsoft.com/office/drawing/2015/10/21/chartex" xmlns:cx3="http://schemas.microsoft.com/office/drawing/2016/5/9/chartex" xmlns:cx4="http://schemas.microsoft.com/office/drawing/2016/5/10/chartex" xmlns:cx5="http://schemas.microsoft.com/office/drawing/2016/5/11/chartex" xmlns:cx6="http://schemas.microsoft.com/office/drawing/2016/5/12/chartex" xmlns:cx7="http://schemas.microsoft.com/office/drawing/2016/5/13/chartex" xmlns:cx8="http://schemas.microsoft.com/office/drawing/2016/5/14/chartex" xmlns:mc="http://schemas.openxmlformats.org/markup-compatibility/2006" xmlns:aink="http://schemas.microsoft.com/office/drawing/2016/ink" xmlns:am3d="http://schemas.microsoft.com/office/drawing/2017/model3d" xmlns:o="urn:schemas-microsoft-com:office:office" xmlns:oel="http://schemas.microsoft.com/office/2019/extlst" xmlns:r="http://schemas.openxmlformats.org/officeDocument/2006/relationships" xmlns:m="http://schemas.openxmlformats.org/officeDocument/2006/math" xmlns:v="urn:schemas-microsoft-com:vml" xmlns:wp14="http://schemas.microsoft.com/office/word/2010/wordprocessingDrawing" xmlns:wp="http://schemas.openxmlformats.org/drawingml/2006/wordprocessingDrawing" xmlns:w10="urn:schemas-microsoft-com:office:word" xmlns:w="http://schemas.openxmlformats.org/wordprocessingml/2006/main" xmlns:w14="http://schemas.microsoft.com/office/word/2010/wordml" xmlns:w15="http://schemas.microsoft.com/office/word/2012/wordml" xmlns:w16cex="http://schemas.microsoft.com/office/word/2018/wordml/cex" xmlns:w16cid="http://schemas.microsoft.com/office/word/2016/wordml/cid" xmlns:w16="http://schemas.microsoft.com/office/word/2018/wordml" xmlns:w16du="http://schemas.microsoft.com/office/word/2023/wordml/word16du" xmlns:w16sdtdh="http://schemas.microsoft.com/office/word/2020/wordml/sdtdatahash" xmlns:w16sdtfl="http://schemas.microsoft.com/office/word/2024/wordml/sdtformatlock" xmlns:w16se="http://schemas.microsoft.com/office/word/2015/wordml/symex" xmlns:wpg="http://schemas.microsoft.com/office/word/2010/wordprocessingGroup" xmlns:wpi="http://schemas.microsoft.com/office/word/2010/wordprocessingInk" xmlns:wne="http://schemas.microsoft.com/office/word/2006/wordml" xmlns:wps="http://schemas.microsoft.com/office/word/2010/wordprocessingShape" mc:Ignorable="w14 w15 w16se w16cid w16 w16cex w16sdtdh w16sdtfl w16du wp14">
+  <w:p>
+    <w:pPr>
+      <w:pStyle w:val="Header"/>
+    </w:pPr>
+  </w:p>
+</w:hdr>
+</file>
+
+<file path=word/header2.xml><?xml version="1.0" encoding="utf-8"?>
+<w:hdr xmlns:wpc="http://schemas.microsoft.com/office/word/2010/wordprocessingCanvas" xmlns:cx="http://schemas.microsoft.com/office/drawing/2014/chartex" xmlns:cx1="http://schemas.microsoft.com/office/drawing/2015/9/8/chartex" xmlns:cx2="http://schemas.microsoft.com/office/drawing/2015/10/21/chartex" xmlns:cx3="http://schemas.microsoft.com/office/drawing/2016/5/9/chartex" xmlns:cx4="http://schemas.microsoft.com/office/drawing/2016/5/10/chartex" xmlns:cx5="http://schemas.microsoft.com/office/drawing/2016/5/11/chartex" xmlns:cx6="http://schemas.microsoft.com/office/drawing/2016/5/12/chartex" xmlns:cx7="http://schemas.microsoft.com/office/drawing/2016/5/13/chartex" xmlns:cx8="http://schemas.microsoft.com/office/drawing/2016/5/14/chartex" xmlns:mc="http://schemas.openxmlformats.org/markup-compatibility/2006" xmlns:aink="http://schemas.microsoft.com/office/drawing/2016/ink" xmlns:am3d="http://schemas.microsoft.com/office/drawing/2017/model3d" xmlns:o="urn:schemas-microsoft-com:office:office" xmlns:oel="http://schemas.microsoft.com/office/2019/extlst" xmlns:r="http://schemas.openxmlformats.org/officeDocument/2006/relationships" xmlns:m="http://schemas.openxmlformats.org/officeDocument/2006/math" xmlns:v="urn:schemas-microsoft-com:vml" xmlns:wp14="http://schemas.microsoft.com/office/word/2010/wordprocessingDrawing" xmlns:wp="http://schemas.openxmlformats.org/drawingml/2006/wordprocessingDrawing" xmlns:w10="urn:schemas-microsoft-com:office:word" xmlns:w="http://schemas.openxmlformats.org/wordprocessingml/2006/main" xmlns:w14="http://schemas.microsoft.com/office/word/2010/wordml" xmlns:w15="http://schemas.microsoft.com/office/word/2012/wordml" xmlns:w16cex="http://schemas.microsoft.com/office/word/2018/wordml/cex" xmlns:w16cid="http://schemas.microsoft.com/office/word/2016/wordml/cid" xmlns:w16="http://schemas.microsoft.com/office/word/2018/wordml" xmlns:w16du="http://schemas.microsoft.com/office/word/2023/wordml/word16du" xmlns:w16sdtdh="http://schemas.microsoft.com/office/word/2020/wordml/sdtdatahash" xmlns:w16sdtfl="http://schemas.microsoft.com/office/word/2024/wordml/sdtformatlock" xmlns:w16se="http://schemas.microsoft.com/office/word/2015/wordml/symex" xmlns:wpg="http://schemas.microsoft.com/office/word/2010/wordprocessingGroup" xmlns:wpi="http://schemas.microsoft.com/office/word/2010/wordprocessingInk" xmlns:wne="http://schemas.microsoft.com/office/word/2006/wordml" xmlns:wps="http://schemas.microsoft.com/office/word/2010/wordprocessingShape" mc:Ignorable="w14 w15 w16se w16cid w16 w16cex w16sdtdh w16sdtfl w16du wp14">
+  <w:p>
+    <w:pPr>
+      <w:pStyle w:val="Header"/>
+    </w:pPr>
+  </w:p>
+</w:hdr>
+</file>
+
+<file path=word/header3.xml><?xml version="1.0" encoding="utf-8"?>
+<w:hdr xmlns:wpc="http://schemas.microsoft.com/office/word/2010/wordprocessingCanvas" xmlns:cx="http://schemas.microsoft.com/office/drawing/2014/chartex" xmlns:cx1="http://schemas.microsoft.com/office/drawing/2015/9/8/chartex" xmlns:cx2="http://schemas.microsoft.com/office/drawing/2015/10/21/chartex" xmlns:cx3="http://schemas.microsoft.com/office/drawing/2016/5/9/chartex" xmlns:cx4="http://schemas.microsoft.com/office/drawing/2016/5/10/chartex" xmlns:cx5="http://schemas.microsoft.com/office/drawing/2016/5/11/chartex" xmlns:cx6="http://schemas.microsoft.com/office/drawing/2016/5/12/chartex" xmlns:cx7="http://schemas.microsoft.com/office/drawing/2016/5/13/chartex" xmlns:cx8="http://schemas.microsoft.com/office/drawing/2016/5/14/chartex" xmlns:mc="http://schemas.openxmlformats.org/markup-compatibility/2006" xmlns:aink="http://schemas.microsoft.com/office/drawing/2016/ink" xmlns:am3d="http://schemas.microsoft.com/office/drawing/2017/model3d" xmlns:o="urn:schemas-microsoft-com:office:office" xmlns:oel="http://schemas.microsoft.com/office/2019/extlst" xmlns:r="http://schemas.openxmlformats.org/officeDocument/2006/relationships" xmlns:m="http://schemas.openxmlformats.org/officeDocument/2006/math" xmlns:v="urn:schemas-microsoft-com:vml" xmlns:wp14="http://schemas.microsoft.com/office/word/2010/wordprocessingDrawing" xmlns:wp="http://schemas.openxmlformats.org/drawingml/2006/wordprocessingDrawing" xmlns:w10="urn:schemas-microsoft-com:office:word" xmlns:w="http://schemas.openxmlformats.org/wordprocessingml/2006/main" xmlns:w14="http://schemas.microsoft.com/office/word/2010/wordml" xmlns:w15="http://schemas.microsoft.com/office/word/2012/wordml" xmlns:w16cex="http://schemas.microsoft.com/office/word/2018/wordml/cex" xmlns:w16cid="http://schemas.microsoft.com/office/word/2016/wordml/cid" xmlns:w16="http://schemas.microsoft.com/office/word/2018/wordml" xmlns:w16du="http://schemas.microsoft.com/office/word/2023/wordml/word16du" xmlns:w16sdtdh="http://schemas.microsoft.com/office/word/2020/wordml/sdtdatahash" xmlns:w16sdtfl="http://schemas.microsoft.com/office/word/2024/wordml/sdtformatlock" xmlns:w16se="http://schemas.microsoft.com/office/word/2015/wordml/symex" xmlns:wpg="http://schemas.microsoft.com/office/word/2010/wordprocessingGroup" xmlns:wpi="http://schemas.microsoft.com/office/word/2010/wordprocessingInk" xmlns:wne="http://schemas.microsoft.com/office/word/2006/wordml" xmlns:wps="http://schemas.microsoft.com/office/word/2010/wordprocessingShape" mc:Ignorable="w14 w15 w16se w16cid w16 w16cex w16sdtdh w16sdtfl w16du wp14">
+  <w:p>
+    <w:pPr>
+      <w:pStyle w:val="Header"/>
+    </w:pPr>
+  </w:p>
+</w:hdr>
 </file>
 
 <file path=word/numbering.xml><?xml version="1.0" encoding="utf-8"?>

</xml_diff>